<commit_message>
feat: header 1 and 2
</commit_message>
<xml_diff>
--- a/Documentation/Documentation.docx
+++ b/Documentation/Documentation.docx
@@ -1239,7 +1239,7 @@
       <w:pPr>
         <w:pStyle w:val="Heading2"/>
       </w:pPr>
-      <w:bookmarkStart w:id="0" w:name="_Toc208754248"/>
+      <w:bookmarkStart w:id="0" w:name="_Toc208755386"/>
       <w:r>
         <w:t>Επιτελική Σύνοψη</w:t>
       </w:r>
@@ -1485,7 +1485,7 @@
       <w:pPr>
         <w:pStyle w:val="Heading2"/>
       </w:pPr>
-      <w:bookmarkStart w:id="1" w:name="_Toc208754249"/>
+      <w:bookmarkStart w:id="1" w:name="_Toc208755387"/>
       <w:r>
         <w:t>Ευχαριστίες</w:t>
       </w:r>
@@ -1570,7 +1570,7 @@
           <w:rFonts w:ascii="Times New Roman" w:hAnsi="Times New Roman"/>
         </w:rPr>
       </w:pPr>
-      <w:bookmarkStart w:id="2" w:name="_Toc208754250"/>
+      <w:bookmarkStart w:id="2" w:name="_Toc208755388"/>
       <w:r>
         <w:rPr>
           <w:rFonts w:ascii="Times New Roman" w:hAnsi="Times New Roman"/>
@@ -1619,7 +1619,7 @@
         </w:rPr>
         <w:fldChar w:fldCharType="separate"/>
       </w:r>
-      <w:hyperlink w:anchor="_Toc208754248" w:history="1">
+      <w:hyperlink w:anchor="_Toc208755386" w:history="1">
         <w:r>
           <w:rPr>
             <w:rStyle w:val="Hyperlink"/>
@@ -1646,7 +1646,7 @@
             <w:noProof/>
             <w:webHidden/>
           </w:rPr>
-          <w:instrText xml:space="preserve"> PAGEREF _Toc208754248 \h </w:instrText>
+          <w:instrText xml:space="preserve"> PAGEREF _Toc208755386 \h </w:instrText>
         </w:r>
         <w:r>
           <w:rPr>
@@ -1693,7 +1693,7 @@
           <w14:ligatures w14:val="standardContextual"/>
         </w:rPr>
       </w:pPr>
-      <w:hyperlink w:anchor="_Toc208754249" w:history="1">
+      <w:hyperlink w:anchor="_Toc208755387" w:history="1">
         <w:r>
           <w:rPr>
             <w:rStyle w:val="Hyperlink"/>
@@ -1720,7 +1720,7 @@
             <w:noProof/>
             <w:webHidden/>
           </w:rPr>
-          <w:instrText xml:space="preserve"> PAGEREF _Toc208754249 \h </w:instrText>
+          <w:instrText xml:space="preserve"> PAGEREF _Toc208755387 \h </w:instrText>
         </w:r>
         <w:r>
           <w:rPr>
@@ -1764,7 +1764,7 @@
           <w14:ligatures w14:val="standardContextual"/>
         </w:rPr>
       </w:pPr>
-      <w:hyperlink w:anchor="_Toc208754250" w:history="1">
+      <w:hyperlink w:anchor="_Toc208755388" w:history="1">
         <w:r>
           <w:rPr>
             <w:rStyle w:val="Hyperlink"/>
@@ -1792,7 +1792,7 @@
             <w:noProof/>
             <w:webHidden/>
           </w:rPr>
-          <w:instrText xml:space="preserve"> PAGEREF _Toc208754250 \h </w:instrText>
+          <w:instrText xml:space="preserve"> PAGEREF _Toc208755388 \h </w:instrText>
         </w:r>
         <w:r>
           <w:rPr>
@@ -1836,7 +1836,7 @@
           <w14:ligatures w14:val="standardContextual"/>
         </w:rPr>
       </w:pPr>
-      <w:hyperlink w:anchor="_Toc208754251" w:history="1">
+      <w:hyperlink w:anchor="_Toc208755389" w:history="1">
         <w:r>
           <w:rPr>
             <w:rStyle w:val="Hyperlink"/>
@@ -1864,7 +1864,7 @@
             <w:noProof/>
             <w:webHidden/>
           </w:rPr>
-          <w:instrText xml:space="preserve"> PAGEREF _Toc208754251 \h </w:instrText>
+          <w:instrText xml:space="preserve"> PAGEREF _Toc208755389 \h </w:instrText>
         </w:r>
         <w:r>
           <w:rPr>
@@ -1911,7 +1911,7 @@
           <w14:ligatures w14:val="standardContextual"/>
         </w:rPr>
       </w:pPr>
-      <w:hyperlink w:anchor="_Toc208754252" w:history="1">
+      <w:hyperlink w:anchor="_Toc208755390" w:history="1">
         <w:r>
           <w:rPr>
             <w:rStyle w:val="Hyperlink"/>
@@ -1939,7 +1939,7 @@
             <w:noProof/>
             <w:webHidden/>
           </w:rPr>
-          <w:instrText xml:space="preserve"> PAGEREF _Toc208754252 \h </w:instrText>
+          <w:instrText xml:space="preserve"> PAGEREF _Toc208755390 \h </w:instrText>
         </w:r>
         <w:r>
           <w:rPr>
@@ -1983,7 +1983,7 @@
           <w14:ligatures w14:val="standardContextual"/>
         </w:rPr>
       </w:pPr>
-      <w:hyperlink w:anchor="_Toc208754253" w:history="1">
+      <w:hyperlink w:anchor="_Toc208755391" w:history="1">
         <w:r>
           <w:rPr>
             <w:rStyle w:val="Hyperlink"/>
@@ -2010,7 +2010,7 @@
             <w:noProof/>
             <w:webHidden/>
           </w:rPr>
-          <w:instrText xml:space="preserve"> PAGEREF _Toc208754253 \h </w:instrText>
+          <w:instrText xml:space="preserve"> PAGEREF _Toc208755391 \h </w:instrText>
         </w:r>
         <w:r>
           <w:rPr>
@@ -2057,7 +2057,7 @@
           <w14:ligatures w14:val="standardContextual"/>
         </w:rPr>
       </w:pPr>
-      <w:hyperlink w:anchor="_Toc208754254" w:history="1">
+      <w:hyperlink w:anchor="_Toc208755392" w:history="1">
         <w:r>
           <w:rPr>
             <w:rStyle w:val="Hyperlink"/>
@@ -2085,7 +2085,7 @@
             <w:noProof/>
             <w:webHidden/>
           </w:rPr>
-          <w:instrText xml:space="preserve"> PAGEREF _Toc208754254 \h </w:instrText>
+          <w:instrText xml:space="preserve"> PAGEREF _Toc208755392 \h </w:instrText>
         </w:r>
         <w:r>
           <w:rPr>
@@ -2129,7 +2129,7 @@
           <w14:ligatures w14:val="standardContextual"/>
         </w:rPr>
       </w:pPr>
-      <w:hyperlink w:anchor="_Toc208754255" w:history="1">
+      <w:hyperlink w:anchor="_Toc208755393" w:history="1">
         <w:r>
           <w:rPr>
             <w:rStyle w:val="Hyperlink"/>
@@ -2157,7 +2157,7 @@
             <w:noProof/>
             <w:webHidden/>
           </w:rPr>
-          <w:instrText xml:space="preserve"> PAGEREF _Toc208754255 \h </w:instrText>
+          <w:instrText xml:space="preserve"> PAGEREF _Toc208755393 \h </w:instrText>
         </w:r>
         <w:r>
           <w:rPr>
@@ -2204,7 +2204,7 @@
           <w14:ligatures w14:val="standardContextual"/>
         </w:rPr>
       </w:pPr>
-      <w:hyperlink w:anchor="_Toc208754256" w:history="1">
+      <w:hyperlink w:anchor="_Toc208755394" w:history="1">
         <w:r>
           <w:rPr>
             <w:rStyle w:val="Hyperlink"/>
@@ -2232,7 +2232,7 @@
             <w:noProof/>
             <w:webHidden/>
           </w:rPr>
-          <w:instrText xml:space="preserve"> PAGEREF _Toc208754256 \h </w:instrText>
+          <w:instrText xml:space="preserve"> PAGEREF _Toc208755394 \h </w:instrText>
         </w:r>
         <w:r>
           <w:rPr>
@@ -2276,7 +2276,7 @@
           <w14:ligatures w14:val="standardContextual"/>
         </w:rPr>
       </w:pPr>
-      <w:hyperlink w:anchor="_Toc208754257" w:history="1">
+      <w:hyperlink w:anchor="_Toc208755395" w:history="1">
         <w:r>
           <w:rPr>
             <w:rStyle w:val="Hyperlink"/>
@@ -2303,7 +2303,7 @@
             <w:noProof/>
             <w:webHidden/>
           </w:rPr>
-          <w:instrText xml:space="preserve"> PAGEREF _Toc208754257 \h </w:instrText>
+          <w:instrText xml:space="preserve"> PAGEREF _Toc208755395 \h </w:instrText>
         </w:r>
         <w:r>
           <w:rPr>
@@ -2350,7 +2350,7 @@
           <w14:ligatures w14:val="standardContextual"/>
         </w:rPr>
       </w:pPr>
-      <w:hyperlink w:anchor="_Toc208754258" w:history="1">
+      <w:hyperlink w:anchor="_Toc208755396" w:history="1">
         <w:r>
           <w:rPr>
             <w:rStyle w:val="Hyperlink"/>
@@ -2378,7 +2378,7 @@
             <w:noProof/>
             <w:webHidden/>
           </w:rPr>
-          <w:instrText xml:space="preserve"> PAGEREF _Toc208754258 \h </w:instrText>
+          <w:instrText xml:space="preserve"> PAGEREF _Toc208755396 \h </w:instrText>
         </w:r>
         <w:r>
           <w:rPr>
@@ -2422,7 +2422,7 @@
           <w14:ligatures w14:val="standardContextual"/>
         </w:rPr>
       </w:pPr>
-      <w:hyperlink w:anchor="_Toc208754259" w:history="1">
+      <w:hyperlink w:anchor="_Toc208755397" w:history="1">
         <w:r>
           <w:rPr>
             <w:rStyle w:val="Hyperlink"/>
@@ -2449,7 +2449,7 @@
             <w:noProof/>
             <w:webHidden/>
           </w:rPr>
-          <w:instrText xml:space="preserve"> PAGEREF _Toc208754259 \h </w:instrText>
+          <w:instrText xml:space="preserve"> PAGEREF _Toc208755397 \h </w:instrText>
         </w:r>
         <w:r>
           <w:rPr>
@@ -2496,7 +2496,7 @@
           <w14:ligatures w14:val="standardContextual"/>
         </w:rPr>
       </w:pPr>
-      <w:hyperlink w:anchor="_Toc208754260" w:history="1">
+      <w:hyperlink w:anchor="_Toc208755398" w:history="1">
         <w:r>
           <w:rPr>
             <w:rStyle w:val="Hyperlink"/>
@@ -2524,7 +2524,7 @@
             <w:noProof/>
             <w:webHidden/>
           </w:rPr>
-          <w:instrText xml:space="preserve"> PAGEREF _Toc208754260 \h </w:instrText>
+          <w:instrText xml:space="preserve"> PAGEREF _Toc208755398 \h </w:instrText>
         </w:r>
         <w:r>
           <w:rPr>
@@ -2568,7 +2568,7 @@
           <w14:ligatures w14:val="standardContextual"/>
         </w:rPr>
       </w:pPr>
-      <w:hyperlink w:anchor="_Toc208754261" w:history="1">
+      <w:hyperlink w:anchor="_Toc208755399" w:history="1">
         <w:r>
           <w:rPr>
             <w:rStyle w:val="Hyperlink"/>
@@ -2595,7 +2595,7 @@
             <w:noProof/>
             <w:webHidden/>
           </w:rPr>
-          <w:instrText xml:space="preserve"> PAGEREF _Toc208754261 \h </w:instrText>
+          <w:instrText xml:space="preserve"> PAGEREF _Toc208755399 \h </w:instrText>
         </w:r>
         <w:r>
           <w:rPr>
@@ -2642,7 +2642,7 @@
           <w14:ligatures w14:val="standardContextual"/>
         </w:rPr>
       </w:pPr>
-      <w:hyperlink w:anchor="_Toc208754262" w:history="1">
+      <w:hyperlink w:anchor="_Toc208755400" w:history="1">
         <w:r>
           <w:rPr>
             <w:rStyle w:val="Hyperlink"/>
@@ -2670,7 +2670,7 @@
             <w:noProof/>
             <w:webHidden/>
           </w:rPr>
-          <w:instrText xml:space="preserve"> PAGEREF _Toc208754262 \h </w:instrText>
+          <w:instrText xml:space="preserve"> PAGEREF _Toc208755400 \h </w:instrText>
         </w:r>
         <w:r>
           <w:rPr>
@@ -2703,7 +2703,10 @@
     </w:p>
     <w:p>
       <w:pPr>
-        <w:pStyle w:val="TOC3"/>
+        <w:pStyle w:val="TOC2"/>
+        <w:tabs>
+          <w:tab w:val="right" w:leader="dot" w:pos="8942"/>
+        </w:tabs>
         <w:rPr>
           <w:rFonts w:asciiTheme="minorHAnsi" w:eastAsiaTheme="minorEastAsia" w:hAnsiTheme="minorHAnsi" w:cstheme="minorBidi"/>
           <w:noProof/>
@@ -2714,13 +2717,14 @@
           <w14:ligatures w14:val="standardContextual"/>
         </w:rPr>
       </w:pPr>
-      <w:hyperlink w:anchor="_Toc208754263" w:history="1">
+      <w:hyperlink w:anchor="_Toc208755401" w:history="1">
         <w:r>
           <w:rPr>
             <w:rStyle w:val="Hyperlink"/>
+            <w:i/>
             <w:noProof/>
           </w:rPr>
-          <w:t>Συμπεράσματα</w:t>
+          <w:t>Κεφάλαιο 7ο</w:t>
         </w:r>
         <w:r>
           <w:rPr>
@@ -2741,7 +2745,7 @@
             <w:noProof/>
             <w:webHidden/>
           </w:rPr>
-          <w:instrText xml:space="preserve"> PAGEREF _Toc208754263 \h </w:instrText>
+          <w:instrText xml:space="preserve"> PAGEREF _Toc208755401 \h </w:instrText>
         </w:r>
         <w:r>
           <w:rPr>
@@ -2774,7 +2778,10 @@
     </w:p>
     <w:p>
       <w:pPr>
-        <w:pStyle w:val="TOC3"/>
+        <w:pStyle w:val="TOC2"/>
+        <w:tabs>
+          <w:tab w:val="right" w:leader="dot" w:pos="8942"/>
+        </w:tabs>
         <w:rPr>
           <w:rFonts w:asciiTheme="minorHAnsi" w:eastAsiaTheme="minorEastAsia" w:hAnsiTheme="minorHAnsi" w:cstheme="minorBidi"/>
           <w:noProof/>
@@ -2785,13 +2792,14 @@
           <w14:ligatures w14:val="standardContextual"/>
         </w:rPr>
       </w:pPr>
-      <w:hyperlink w:anchor="_Toc208754264" w:history="1">
+      <w:hyperlink w:anchor="_Toc208755402" w:history="1">
         <w:r>
           <w:rPr>
             <w:rStyle w:val="Hyperlink"/>
+            <w:i/>
             <w:noProof/>
           </w:rPr>
-          <w:t>Βιβλιογραφικές Πηγές</w:t>
+          <w:t>Κεφάλαιο 8ο</w:t>
         </w:r>
         <w:r>
           <w:rPr>
@@ -2812,7 +2820,7 @@
             <w:noProof/>
             <w:webHidden/>
           </w:rPr>
-          <w:instrText xml:space="preserve"> PAGEREF _Toc208754264 \h </w:instrText>
+          <w:instrText xml:space="preserve"> PAGEREF _Toc208755402 \h </w:instrText>
         </w:r>
         <w:r>
           <w:rPr>
@@ -2845,10 +2853,7 @@
     </w:p>
     <w:p>
       <w:pPr>
-        <w:pStyle w:val="TOC1"/>
-        <w:tabs>
-          <w:tab w:val="right" w:leader="dot" w:pos="8942"/>
-        </w:tabs>
+        <w:pStyle w:val="TOC3"/>
         <w:rPr>
           <w:rFonts w:asciiTheme="minorHAnsi" w:eastAsiaTheme="minorEastAsia" w:hAnsiTheme="minorHAnsi" w:cstheme="minorBidi"/>
           <w:noProof/>
@@ -2859,14 +2864,13 @@
           <w14:ligatures w14:val="standardContextual"/>
         </w:rPr>
       </w:pPr>
-      <w:hyperlink w:anchor="_Toc208754265" w:history="1">
+      <w:hyperlink w:anchor="_Toc208755403" w:history="1">
         <w:r>
           <w:rPr>
             <w:rStyle w:val="Hyperlink"/>
             <w:noProof/>
-            <w:lang w:val="en-GB"/>
           </w:rPr>
-          <w:t>Works Cited</w:t>
+          <w:t>Συμπεράσματα</w:t>
         </w:r>
         <w:r>
           <w:rPr>
@@ -2887,7 +2891,7 @@
             <w:noProof/>
             <w:webHidden/>
           </w:rPr>
-          <w:instrText xml:space="preserve"> PAGEREF _Toc208754265 \h </w:instrText>
+          <w:instrText xml:space="preserve"> PAGEREF _Toc208755403 \h </w:instrText>
         </w:r>
         <w:r>
           <w:rPr>
@@ -2919,6 +2923,227 @@
       </w:hyperlink>
     </w:p>
     <w:p>
+      <w:pPr>
+        <w:pStyle w:val="TOC2"/>
+        <w:tabs>
+          <w:tab w:val="right" w:leader="dot" w:pos="8942"/>
+        </w:tabs>
+        <w:rPr>
+          <w:rFonts w:asciiTheme="minorHAnsi" w:eastAsiaTheme="minorEastAsia" w:hAnsiTheme="minorHAnsi" w:cstheme="minorBidi"/>
+          <w:noProof/>
+          <w:kern w:val="2"/>
+          <w:sz w:val="24"/>
+          <w:szCs w:val="24"/>
+          <w:lang w:val="en-GB" w:eastAsia="en-GB"/>
+          <w14:ligatures w14:val="standardContextual"/>
+        </w:rPr>
+      </w:pPr>
+      <w:hyperlink w:anchor="_Toc208755404" w:history="1">
+        <w:r>
+          <w:rPr>
+            <w:rStyle w:val="Hyperlink"/>
+            <w:i/>
+            <w:noProof/>
+          </w:rPr>
+          <w:t>Κεφάλαιο 9ο</w:t>
+        </w:r>
+        <w:r>
+          <w:rPr>
+            <w:noProof/>
+            <w:webHidden/>
+          </w:rPr>
+          <w:tab/>
+        </w:r>
+        <w:r>
+          <w:rPr>
+            <w:noProof/>
+            <w:webHidden/>
+          </w:rPr>
+          <w:fldChar w:fldCharType="begin"/>
+        </w:r>
+        <w:r>
+          <w:rPr>
+            <w:noProof/>
+            <w:webHidden/>
+          </w:rPr>
+          <w:instrText xml:space="preserve"> PAGEREF _Toc208755404 \h </w:instrText>
+        </w:r>
+        <w:r>
+          <w:rPr>
+            <w:noProof/>
+            <w:webHidden/>
+          </w:rPr>
+        </w:r>
+        <w:r>
+          <w:rPr>
+            <w:noProof/>
+            <w:webHidden/>
+          </w:rPr>
+          <w:fldChar w:fldCharType="separate"/>
+        </w:r>
+        <w:r>
+          <w:rPr>
+            <w:noProof/>
+            <w:webHidden/>
+          </w:rPr>
+          <w:t>16</w:t>
+        </w:r>
+        <w:r>
+          <w:rPr>
+            <w:noProof/>
+            <w:webHidden/>
+          </w:rPr>
+          <w:fldChar w:fldCharType="end"/>
+        </w:r>
+      </w:hyperlink>
+    </w:p>
+    <w:p>
+      <w:pPr>
+        <w:pStyle w:val="TOC3"/>
+        <w:rPr>
+          <w:rFonts w:asciiTheme="minorHAnsi" w:eastAsiaTheme="minorEastAsia" w:hAnsiTheme="minorHAnsi" w:cstheme="minorBidi"/>
+          <w:noProof/>
+          <w:kern w:val="2"/>
+          <w:sz w:val="24"/>
+          <w:szCs w:val="24"/>
+          <w:lang w:val="en-GB" w:eastAsia="en-GB"/>
+          <w14:ligatures w14:val="standardContextual"/>
+        </w:rPr>
+      </w:pPr>
+      <w:hyperlink w:anchor="_Toc208755405" w:history="1">
+        <w:r>
+          <w:rPr>
+            <w:rStyle w:val="Hyperlink"/>
+            <w:noProof/>
+          </w:rPr>
+          <w:t>Βιβλιογραφικές Πηγές</w:t>
+        </w:r>
+        <w:r>
+          <w:rPr>
+            <w:noProof/>
+            <w:webHidden/>
+          </w:rPr>
+          <w:tab/>
+        </w:r>
+        <w:r>
+          <w:rPr>
+            <w:noProof/>
+            <w:webHidden/>
+          </w:rPr>
+          <w:fldChar w:fldCharType="begin"/>
+        </w:r>
+        <w:r>
+          <w:rPr>
+            <w:noProof/>
+            <w:webHidden/>
+          </w:rPr>
+          <w:instrText xml:space="preserve"> PAGEREF _Toc208755405 \h </w:instrText>
+        </w:r>
+        <w:r>
+          <w:rPr>
+            <w:noProof/>
+            <w:webHidden/>
+          </w:rPr>
+        </w:r>
+        <w:r>
+          <w:rPr>
+            <w:noProof/>
+            <w:webHidden/>
+          </w:rPr>
+          <w:fldChar w:fldCharType="separate"/>
+        </w:r>
+        <w:r>
+          <w:rPr>
+            <w:noProof/>
+            <w:webHidden/>
+          </w:rPr>
+          <w:t>16</w:t>
+        </w:r>
+        <w:r>
+          <w:rPr>
+            <w:noProof/>
+            <w:webHidden/>
+          </w:rPr>
+          <w:fldChar w:fldCharType="end"/>
+        </w:r>
+      </w:hyperlink>
+    </w:p>
+    <w:p>
+      <w:pPr>
+        <w:pStyle w:val="TOC1"/>
+        <w:tabs>
+          <w:tab w:val="right" w:leader="dot" w:pos="8942"/>
+        </w:tabs>
+        <w:rPr>
+          <w:rFonts w:asciiTheme="minorHAnsi" w:eastAsiaTheme="minorEastAsia" w:hAnsiTheme="minorHAnsi" w:cstheme="minorBidi"/>
+          <w:noProof/>
+          <w:kern w:val="2"/>
+          <w:sz w:val="24"/>
+          <w:szCs w:val="24"/>
+          <w:lang w:val="en-GB" w:eastAsia="en-GB"/>
+          <w14:ligatures w14:val="standardContextual"/>
+        </w:rPr>
+      </w:pPr>
+      <w:hyperlink w:anchor="_Toc208755406" w:history="1">
+        <w:r>
+          <w:rPr>
+            <w:rStyle w:val="Hyperlink"/>
+            <w:noProof/>
+            <w:lang w:val="en-GB"/>
+          </w:rPr>
+          <w:t>Works Cited</w:t>
+        </w:r>
+        <w:r>
+          <w:rPr>
+            <w:noProof/>
+            <w:webHidden/>
+          </w:rPr>
+          <w:tab/>
+        </w:r>
+        <w:r>
+          <w:rPr>
+            <w:noProof/>
+            <w:webHidden/>
+          </w:rPr>
+          <w:fldChar w:fldCharType="begin"/>
+        </w:r>
+        <w:r>
+          <w:rPr>
+            <w:noProof/>
+            <w:webHidden/>
+          </w:rPr>
+          <w:instrText xml:space="preserve"> PAGEREF _Toc208755406 \h </w:instrText>
+        </w:r>
+        <w:r>
+          <w:rPr>
+            <w:noProof/>
+            <w:webHidden/>
+          </w:rPr>
+        </w:r>
+        <w:r>
+          <w:rPr>
+            <w:noProof/>
+            <w:webHidden/>
+          </w:rPr>
+          <w:fldChar w:fldCharType="separate"/>
+        </w:r>
+        <w:r>
+          <w:rPr>
+            <w:noProof/>
+            <w:webHidden/>
+          </w:rPr>
+          <w:t>16</w:t>
+        </w:r>
+        <w:r>
+          <w:rPr>
+            <w:noProof/>
+            <w:webHidden/>
+          </w:rPr>
+          <w:fldChar w:fldCharType="end"/>
+        </w:r>
+      </w:hyperlink>
+    </w:p>
+    <w:p>
       <w:r>
         <w:rPr>
           <w:b/>
@@ -2946,7 +3171,7 @@
           <w:rFonts w:ascii="Times New Roman" w:hAnsi="Times New Roman"/>
         </w:rPr>
       </w:pPr>
-      <w:bookmarkStart w:id="3" w:name="_Toc208754251"/>
+      <w:bookmarkStart w:id="3" w:name="_Toc208755389"/>
       <w:r>
         <w:rPr>
           <w:rFonts w:ascii="Times New Roman" w:hAnsi="Times New Roman"/>
@@ -3045,22 +3270,6 @@
     </w:p>
     <w:p>
       <w:pPr>
-        <w:spacing w:before="360" w:after="360"/>
-        <w:jc w:val="both"/>
-        <w:rPr>
-          <w:b/>
-          <w:bCs/>
-          <w:sz w:val="28"/>
-          <w:szCs w:val="28"/>
-          <w:lang w:val="en-GB" w:eastAsia="en-GB"/>
-        </w:rPr>
-      </w:pPr>
-      <w:r>
-        <w:br w:type="page"/>
-      </w:r>
-    </w:p>
-    <w:p>
-      <w:pPr>
         <w:pStyle w:val="Heading2"/>
         <w:jc w:val="right"/>
         <w:rPr>
@@ -3071,7 +3280,7 @@
           <w:u w:val="none"/>
         </w:rPr>
       </w:pPr>
-      <w:bookmarkStart w:id="4" w:name="_Toc208754252"/>
+      <w:bookmarkStart w:id="4" w:name="_Toc208755390"/>
       <w:r>
         <w:rPr>
           <w:bCs w:val="0"/>
@@ -3091,7 +3300,7 @@
       </w:pPr>
       <w:bookmarkStart w:id="5" w:name="__RefHeading___Toc306572100"/>
       <w:bookmarkStart w:id="6" w:name="_Toc201336593"/>
-      <w:bookmarkStart w:id="7" w:name="_Toc208754253"/>
+      <w:bookmarkStart w:id="7" w:name="_Toc208755391"/>
       <w:bookmarkEnd w:id="5"/>
       <w:r>
         <w:t>Εισαγωγή</w:t>
@@ -3927,7 +4136,7 @@
           <w:u w:val="none"/>
         </w:rPr>
       </w:pPr>
-      <w:bookmarkStart w:id="26" w:name="_Toc208754254"/>
+      <w:bookmarkStart w:id="26" w:name="_Toc208755392"/>
       <w:r>
         <w:rPr>
           <w:bCs w:val="0"/>
@@ -3949,7 +4158,7 @@
         </w:rPr>
       </w:pPr>
       <w:bookmarkStart w:id="27" w:name="__RefHeading___Toc306572114"/>
-      <w:bookmarkStart w:id="28" w:name="_Toc208754255"/>
+      <w:bookmarkStart w:id="28" w:name="_Toc208755393"/>
       <w:bookmarkEnd w:id="27"/>
       <w:r>
         <w:rPr>
@@ -5972,13 +6181,7 @@
     </w:p>
     <w:p>
       <w:pPr>
-        <w:pStyle w:val="-"/>
-        <w:ind w:firstLine="360"/>
-        <w:rPr>
-          <w:rFonts w:ascii="Times New Roman" w:hAnsi="Times New Roman" w:cs="Times New Roman"/>
-          <w:b/>
-          <w:bCs/>
-          <w:color w:val="77206D" w:themeColor="accent5" w:themeShade="BF"/>
+        <w:rPr>
           <w:highlight w:val="lightGray"/>
         </w:rPr>
       </w:pPr>
@@ -6004,7 +6207,7 @@
         </w:rPr>
         <w:br w:type="page"/>
       </w:r>
-      <w:bookmarkStart w:id="29" w:name="_Toc208754256"/>
+      <w:bookmarkStart w:id="29" w:name="_Toc208755394"/>
       <w:r>
         <w:rPr>
           <w:bCs w:val="0"/>
@@ -6032,7 +6235,7 @@
       <w:pPr>
         <w:pStyle w:val="Heading3"/>
       </w:pPr>
-      <w:bookmarkStart w:id="30" w:name="_Toc208754257"/>
+      <w:bookmarkStart w:id="30" w:name="_Toc208755395"/>
       <w:r>
         <w:t>Αναλυτική περιγραφή της υλοποίησης της εφαρμογής</w:t>
       </w:r>
@@ -6073,7 +6276,7 @@
       <w:r>
         <w:br w:type="page"/>
       </w:r>
-      <w:bookmarkStart w:id="31" w:name="_Toc208754258"/>
+      <w:bookmarkStart w:id="31" w:name="_Toc208755396"/>
       <w:r>
         <w:rPr>
           <w:bCs w:val="0"/>
@@ -6091,7 +6294,7 @@
       <w:pPr>
         <w:pStyle w:val="Heading3"/>
       </w:pPr>
-      <w:bookmarkStart w:id="32" w:name="_Toc208754259"/>
+      <w:bookmarkStart w:id="32" w:name="_Toc208755397"/>
       <w:r>
         <w:t>Ιστοσελίδα 1</w:t>
       </w:r>
@@ -7432,27 +7635,9 @@
         <w:t>)</w:t>
       </w:r>
     </w:p>
-    <w:p>
-      <w:pPr>
-        <w:rPr>
-          <w:color w:val="77206D" w:themeColor="accent5" w:themeShade="BF"/>
-        </w:rPr>
-      </w:pPr>
-    </w:p>
-    <w:p>
-      <w:pPr>
-        <w:rPr>
-          <w:color w:val="77206D" w:themeColor="accent5" w:themeShade="BF"/>
-        </w:rPr>
-      </w:pPr>
-    </w:p>
-    <w:p>
-      <w:pPr>
-        <w:rPr>
-          <w:color w:val="77206D" w:themeColor="accent5" w:themeShade="BF"/>
-        </w:rPr>
-      </w:pPr>
-    </w:p>
+    <w:p/>
+    <w:p/>
+    <w:p/>
     <w:p/>
     <w:p>
       <w:pPr>
@@ -7462,7 +7647,7 @@
       <w:r>
         <w:br w:type="page"/>
       </w:r>
-      <w:bookmarkStart w:id="33" w:name="_Toc208754260"/>
+      <w:bookmarkStart w:id="33" w:name="_Toc208755398"/>
       <w:r>
         <w:rPr>
           <w:bCs w:val="0"/>
@@ -7480,7 +7665,7 @@
       <w:pPr>
         <w:pStyle w:val="Heading3"/>
       </w:pPr>
-      <w:bookmarkStart w:id="34" w:name="_Toc208754261"/>
+      <w:bookmarkStart w:id="34" w:name="_Toc208755399"/>
       <w:r>
         <w:t>Ιστοσελίδα 2</w:t>
       </w:r>
@@ -8872,7 +9057,7 @@
           <w:u w:val="none"/>
         </w:rPr>
       </w:pPr>
-      <w:bookmarkStart w:id="35" w:name="_Toc208754262"/>
+      <w:bookmarkStart w:id="35" w:name="_Toc208755400"/>
       <w:r>
         <w:rPr>
           <w:bCs w:val="0"/>
@@ -10291,6 +10476,7 @@
           <w:u w:val="none"/>
         </w:rPr>
       </w:pPr>
+      <w:bookmarkStart w:id="36" w:name="_Toc208755401"/>
       <w:r>
         <w:rPr>
           <w:bCs w:val="0"/>
@@ -10322,6 +10508,7 @@
         </w:rPr>
         <w:t>ο</w:t>
       </w:r>
+      <w:bookmarkEnd w:id="36"/>
     </w:p>
     <w:p>
       <w:pPr>
@@ -10350,17 +10537,11 @@
     <w:p>
       <w:pPr>
         <w:rPr>
-          <w:color w:val="77206D" w:themeColor="accent5" w:themeShade="BF"/>
-          <w:sz w:val="23"/>
-          <w:szCs w:val="20"/>
-          <w:highlight w:val="lightGray"/>
-        </w:rPr>
-      </w:pPr>
-      <w:r>
-        <w:rPr>
-          <w:color w:val="77206D" w:themeColor="accent5" w:themeShade="BF"/>
-          <w:sz w:val="23"/>
-          <w:szCs w:val="20"/>
+          <w:highlight w:val="lightGray"/>
+        </w:rPr>
+      </w:pPr>
+      <w:r>
+        <w:rPr>
           <w:highlight w:val="lightGray"/>
         </w:rPr>
         <w:t xml:space="preserve"> Συγκριτική Ανάλυση Ιστοσελίδων</w:t>
@@ -11935,6 +12116,7 @@
           <w:u w:val="none"/>
         </w:rPr>
       </w:pPr>
+      <w:bookmarkStart w:id="37" w:name="_Toc208755402"/>
       <w:r>
         <w:rPr>
           <w:bCs w:val="0"/>
@@ -11966,20 +12148,21 @@
         </w:rPr>
         <w:t>ο</w:t>
       </w:r>
+      <w:bookmarkEnd w:id="37"/>
     </w:p>
     <w:p>
       <w:pPr>
         <w:pStyle w:val="Heading3"/>
       </w:pPr>
-      <w:bookmarkStart w:id="36" w:name="__RefHeading___Toc306572116"/>
-      <w:bookmarkStart w:id="37" w:name="_Toc201336603"/>
-      <w:bookmarkStart w:id="38" w:name="_Toc208754263"/>
-      <w:bookmarkEnd w:id="36"/>
+      <w:bookmarkStart w:id="38" w:name="__RefHeading___Toc306572116"/>
+      <w:bookmarkStart w:id="39" w:name="_Toc201336603"/>
+      <w:bookmarkStart w:id="40" w:name="_Toc208755403"/>
+      <w:bookmarkEnd w:id="38"/>
       <w:r>
         <w:t>Συμπεράσματα</w:t>
       </w:r>
-      <w:bookmarkEnd w:id="37"/>
-      <w:bookmarkEnd w:id="38"/>
+      <w:bookmarkEnd w:id="39"/>
+      <w:bookmarkEnd w:id="40"/>
     </w:p>
     <w:p/>
     <w:p>
@@ -12051,15 +12234,6 @@
         </w:rPr>
         <w:t>Στο τέλος και μετά τα συμπεράσματα θα βρίσκονται αναλυτικά όλες οι πηγές της βιβλιογραφίας που χρησιμοποιήθηκαν στην πτυχιακή. Τις αναφορές μπορείτε να τις δημιουργήσετε είτε με κάποιο αυτόματο βοηθητικό εργαλείο (π.χ. εισαγωγή αναφοράς) ή με τη χρήση αριθμημένων στοιχείων.]</w:t>
       </w:r>
-    </w:p>
-    <w:p>
-      <w:pPr>
-        <w:pStyle w:val="-"/>
-        <w:pageBreakBefore/>
-        <w:rPr>
-          <w:rFonts w:ascii="Times New Roman" w:hAnsi="Times New Roman" w:cs="Times New Roman"/>
-        </w:rPr>
-      </w:pPr>
     </w:p>
     <w:p>
       <w:pPr>
@@ -12082,10 +12256,10 @@
           <w:u w:val="none"/>
         </w:rPr>
       </w:pPr>
-      <w:bookmarkStart w:id="39" w:name="__RefHeading___Toc306572117"/>
-      <w:bookmarkStart w:id="40" w:name="_Toc201336604"/>
-      <w:bookmarkStart w:id="41" w:name="_Toc208754264"/>
-      <w:bookmarkEnd w:id="39"/>
+      <w:bookmarkStart w:id="41" w:name="__RefHeading___Toc306572117"/>
+      <w:bookmarkStart w:id="42" w:name="_Toc201336604"/>
+      <w:bookmarkStart w:id="43" w:name="_Toc208755404"/>
+      <w:bookmarkEnd w:id="41"/>
       <w:r>
         <w:rPr>
           <w:bCs w:val="0"/>
@@ -12116,16 +12290,18 @@
         </w:rPr>
         <w:t>ο</w:t>
       </w:r>
+      <w:bookmarkEnd w:id="43"/>
     </w:p>
     <w:p>
       <w:pPr>
         <w:pStyle w:val="Heading3"/>
       </w:pPr>
+      <w:bookmarkStart w:id="44" w:name="_Toc208755405"/>
       <w:r>
         <w:t>Βιβλιογραφικές Πηγές</w:t>
       </w:r>
-      <w:bookmarkEnd w:id="40"/>
-      <w:bookmarkEnd w:id="41"/>
+      <w:bookmarkEnd w:id="42"/>
+      <w:bookmarkEnd w:id="44"/>
     </w:p>
     <w:p>
       <w:pPr>
@@ -12135,7 +12311,7 @@
         </w:rPr>
       </w:pPr>
     </w:p>
-    <w:bookmarkStart w:id="42" w:name="_Toc208754265" w:displacedByCustomXml="next"/>
+    <w:bookmarkStart w:id="45" w:name="_Toc208755406" w:displacedByCustomXml="next"/>
     <w:sdt>
       <w:sdtPr>
         <w:id w:val="-1276861243"/>
@@ -12158,7 +12334,7 @@
             </w:rPr>
             <w:t>Works Cited</w:t>
           </w:r>
-          <w:bookmarkEnd w:id="42"/>
+          <w:bookmarkEnd w:id="45"/>
         </w:p>
         <w:p>
           <w:pPr>
@@ -12620,7 +12796,16 @@
         <w:szCs w:val="20"/>
         <w:lang w:eastAsia="zh-TW"/>
       </w:rPr>
-      <w:t>15</w:t>
+      <w:t>1</w:t>
+    </w:r>
+    <w:r>
+      <w:rPr>
+        <w:rFonts w:cs="Garamond"/>
+        <w:sz w:val="20"/>
+        <w:szCs w:val="20"/>
+        <w:lang w:eastAsia="zh-TW"/>
+      </w:rPr>
+      <w:t>5</w:t>
     </w:r>
     <w:r>
       <w:rPr>

</xml_diff>